<commit_message>
P6: add indexed quad and keyboard help
</commit_message>
<xml_diff>
--- a/EgcLab02/Raspunsuri_Lab02.docx
+++ b/EgcLab02/Raspunsuri_Lab02.docx
@@ -554,6 +554,70 @@
         <w:t>args.time este timpul in secunde de la actualizarea precedenta. inmultim viteza cu acest delta time, astfel deplasarea depinde de timpul real, nu de cate cadre s-au desenat.</w:t>
       </w:r>
     </w:p>
+    <w:p>
+      <w:pPr>
+        <w:pStyle w:val="Heading1"/>
+      </w:pPr>
+      <w:r>
+        <w:t>problema 6</w:t>
+      </w:r>
+    </w:p>
+    <w:p>
+      <w:pPr/>
+      <w:r>
+        <w:t>intrebare: ce reprezinta indicii dreptunghiului?</w:t>
+      </w:r>
+    </w:p>
+    <w:p>
+      <w:pPr/>
+      <w:r>
+        <w:t>raspuns: indicii {0, 1, 2, 2, 3, 0} descriu doua triunghiuri care impart varfurile 0 si 2, asa ca acestea se stocheaza o singura data.</w:t>
+      </w:r>
+    </w:p>
+    <w:p>
+      <w:pPr>
+        <w:pStyle w:val="Heading1"/>
+      </w:pPr>
+      <w:r>
+        <w:t>problema 7</w:t>
+      </w:r>
+    </w:p>
+    <w:p>
+      <w:pPr/>
+      <w:r>
+        <w:t>nota: comportamentele de mai jos sunt asteptari teoretice; experimentele nu au fost observate prin rulare.</w:t>
+      </w:r>
+    </w:p>
+    <w:p>
+      <w:pPr/>
+      <w:r>
+        <w:t>a) modificare: eliminarea GL.EnableVertexAttribArray(1). efect asteptat: atributul generic implicit are rgb (0, 0, 0), deci triunghiul apare negru. restaurare: readaugarea apelului EnableVertexAttribArray(1).</w:t>
+      </w:r>
+    </w:p>
+    <w:p>
+      <w:pPr/>
+      <w:r>
+        <w:t>b) modificare: schimbarea stride-ului la 5 * sizeof(float). efect asteptat: gpu-ul citeste pozitiile si culorile de la inceputuri gresite in sirul de date, deci geometria si culorile se deformeaza. restaurare: 6 * sizeof(float).</w:t>
+      </w:r>
+    </w:p>
+    <w:p>
+      <w:pPr/>
+      <w:r>
+        <w:t>c) modificare: transmiterea count = 2 la GL.DrawElements pentru PrimitiveType.Triangles. efect asteptat: doi indici nu formeaza o primitiva completa, deci triunghiul nu se deseneaza. restaurare: transmiterea celor 3 indici.</w:t>
+      </w:r>
+    </w:p>
+    <w:p>
+      <w:pPr/>
+      <w:r>
+        <w:t>d) modificare: omiterea _shader.Use() inaintea uniformelor si a desenarii. efect asteptat: nu este activ programul shader al triunghiului, astfel actualizarile uniformelor si desenarea sunt invalide in profilul core. restaurare: apelarea _shader.Use() inainte de uniforme.</w:t>
+      </w:r>
+    </w:p>
+    <w:p>
+      <w:pPr/>
+      <w:r>
+        <w:t>e) modificare: legarea bufferului ElementArrayBuffer la 0 inainte de dezlegarea VAO-ului. efect asteptat: legatura EBO este eliminata din VAO, iar GL.DrawElements nu mai are indicii necesari. restaurare: dezlegarea VAO-ului fara sa dezlegam EBO-ul cat timp acesta este activ.</w:t>
+      </w:r>
+    </w:p>
     <w:sectPr>
       <w:pgSz w:w="12240" w:h="15840"/>
       <w:pgMar w:top="1037" w:right="1181" w:bottom="1037" w:left="1181" w:header="720" w:footer="720" w:gutter="0"/>

</xml_diff>